<commit_message>
Publish W10–W18 individual judgment curriculum and Canva handoff
</commit_message>
<xml_diff>
--- a/worksheets/W13_跨立場來源包_學生用.docx
+++ b/worksheets/W13_跨立場來源包_學生用.docx
@@ -208,7 +208,7 @@
           <w:color w:val="5B6573"/>
           <w:sz w:val="18"/>
         </w:rPr>
-        <w:t>判讀提醒｜來源卡是候選資料，不是答案。請回歷程本寫：最初資料、查完後的顏色、先去哪裡找、能支持、不能支持。</w:t>
+        <w:t>判讀提醒｜來源卡是候選資料，不是答案。請在p.2–3記來源代號、能支持與不能支持；APA、原段落與搜尋路徑存線上。</w:t>
       </w:r>
     </w:p>
     <w:p>
@@ -665,7 +665,7 @@
           <w:color w:val="1A2340"/>
           <w:sz w:val="20"/>
         </w:rPr>
-        <w:t>文章沒有說明「專注力」怎麼測，也沒有提供一份不靠校訊 B 的資料。這是個人文章；要再找一份最初資料確認，才能判成綠色。</w:t>
+        <w:t>文章沒有說明「專注力」怎麼測，也沒有提供一份不靠校訊 B 的資料。確認有人這樣主張，不等於主張已證實；須查原資料是否測量其宣稱的效果。</w:t>
       </w:r>
     </w:p>
     <w:p>
@@ -680,7 +680,7 @@
           <w:color w:val="1D4ED8"/>
           <w:sz w:val="19"/>
         </w:rPr>
-        <w:t>最強挑戰四選一｜□ 找到相反結果　□ 有不適用的情況　□ 資料量到的不是我想說的　□ 該查的事沒被記錄。選一項，指出它讓哪一句需要縮小。</w:t>
+        <w:t>整合時先試一句：合看兩份資料，可以多知道＿＿；但條件或記錄範圍不同，還不能說＿＿。判斷留p.3，來源陸續存草稿。</w:t>
       </w:r>
     </w:p>
     <w:p>
@@ -695,7 +695,7 @@
           <w:color w:val="5B6573"/>
           <w:sz w:val="18"/>
         </w:rPr>
-        <w:t>判讀提醒｜來源卡是候選資料，不是答案。請回歷程本寫：最初資料、查完後的顏色、先去哪裡找、能支持、不能支持。</w:t>
+        <w:t>判讀提醒｜來源卡是候選資料，不是答案。請在p.2–3記來源代號、能支持與不能支持；APA、原段落與搜尋路徑存線上。</w:t>
       </w:r>
     </w:p>
     <w:sectPr>

</xml_diff>